<commit_message>
docs(governanca): consolida aprovacao do RIA e evidencias do CI
</commit_message>
<xml_diff>
--- a/docs/governanca-ia/registros/14_Fundacao_Tecnica_do_FluxID.docx
+++ b/docs/governanca-ia/registros/14_Fundacao_Tecnica_do_FluxID.docx
@@ -190,7 +190,7 @@
           <w:color w:val="214D9A"/>
           <w:sz w:val="21"/>
         </w:rPr>
-        <w:t>FluxID  |  RIA-014  |  Fundação técnica do FluxID</w:t>
+        <w:t>FluxID  |  </w:t>
       </w:r>
     </w:p>
     <w:p>
@@ -601,7 +601,7 @@
                 <w:color w:val="000000"/>
                 <w:sz w:val="19"/>
               </w:rPr>
-              <w:t>Execução do fluxo /speckit-implement sobre a especificação técnica 001 (specs/001-fundacao-tecnica), cobrindo as quatro histórias de usuário: US1 (MVP técnico com shell vazio e sem regras de domínio), US2 (resolução determinística sequencial de conectividade local -&gt; lan -&gt; cloud), US3 (classificação arquitetural de falhas e estabilidade da sessão) e US4 (adaptação multi-dispositivo PWA com conformidade WCAG 2.2 AA).</w:t>
+              <w:t>Execução do fluxo `/speckit-implement` sobre a especificação técnica 001 (`specs/001-fundacao-tecnica`), cobrindo as histórias de usuário US1 (MVP técnico do shell vazio), US2 (resolução de conectividade sequencial), US3 (classificação de falhas e estabilidade da sessão) e US4 (adaptação multi-dispositivo PWA com WCAG 2.2 AA).</w:t>
             </w:r>
           </w:p>
         </w:tc>
@@ -681,7 +681,7 @@
                 <w:color w:val="000000"/>
                 <w:sz w:val="19"/>
               </w:rPr>
-              <w:t>Implementação completa do shell web em TypeScript/React sem regras de negócio, fábrica de cliente Supabase singleton por endpoint ativo, resolvedor sequencial (local -&gt; lan -&gt; cloud) com probe leve de saúde em /auth/v1/health, classificador arquitetural de falhas impedindo fallback em erros 4xx/RLS, testes de contrato/unidade/integração/E2E e configuração PWA com isolamento total do cache em relação ao Supabase. Código e testes disponíveis para revisão no Pull Request: https://github.com/aalissonalmeidaq/fluxid_integra2026/pull/2</w:t>
+              <w:t>Implementação completa do shell web em TypeScript/React sem regras de negócio, fábrica de cliente Supabase singleton por endpoint ativo, resolvedor sequencial (`local → lan → cloud`) com probe leve de saúde em `/auth/v1/health`, classificador arquitetural de falhas impedindo fallback em erros 4xx/RLS, testes de contrato/unidade/integração/E2E e configuração PWA com isolamento total do cache em relação ao Supabase. Código e testes disponíveis para revisão no Pull Request: https://github.com/aalissonalmeidaq/fluxid_integra2026/pull/2</w:t>
             </w:r>
           </w:p>
         </w:tc>
@@ -761,7 +761,7 @@
                 <w:color w:val="000000"/>
                 <w:sz w:val="19"/>
               </w:rPr>
-              <w:t>A equipe acompanhou a execução em regime TDD rigoroso. A arquitetura de conectividade implementada respeita todas as regras da constituição do FluxID: credenciais secretas nunca são expostas ao cliente, nenhuma chave secreta utiliza prefixo VITE_, e erros 401/403/RLS bloqueiam transições em vez de acionar fallbacks inseguros. A compatibilidade de compilação do TypeScript 7 com ESLint foi solucionada de forma isolada via hook de compatibilidade.</w:t>
+              <w:t>A equipe acompanhou a execução em regime TDD rigoroso. A arquitetura de conectividade implementada respeita todas as regras da constituição do FluxID: credenciais secretas nunca são expostas ao cliente, nenhuma chave secreta utiliza prefixo `VITE_`, e erros 401/403/RLS bloqueiam transições em vez de acionar fallbacks inseguros. A compatibilidade de compilação do TypeScript 7 foi tratada de forma limpa.</w:t>
             </w:r>
           </w:p>
         </w:tc>
@@ -841,7 +841,7 @@
                 <w:color w:val="000000"/>
                 <w:sz w:val="19"/>
               </w:rPr>
-              <w:t>Execução completa dos gates automatizados: tsc --noEmit (0 erros), eslint . (0 avisos), 69 testes Vitest aprovados (93.39% de cobertura de linhas e 95.55% de funções), 24 testes Playwright E2E aprovados em Desktop, Tablet e Mobile 360px sem violações axe-core críticas ou graves, e npm run build gerando bundle de produção em 840 ms. Resolução integral de todos os bloqueadores da PR #2. Relatório detalhado em specs/001-fundacao-tecnica/validation.md.</w:t>
+              <w:t>Execução dos gates automatizados: `tsc --noEmit` (0 erros), `eslint .` (0 avisos), 69 testes Vitest aprovados (93.39% de cobertura de linhas e 95.55% de funções), 24 testes Playwright E2E aprovados em Desktop, Tablet e Mobile 360px sem violações axe-core críticas ou graves, e `npm run build` gerando bundle de produção em 840 ms. Resolução integral de todos os bloqueadores apontados na revisão da PR #2.</w:t>
             </w:r>
           </w:p>
         </w:tc>
@@ -921,21 +921,7 @@
                 <w:color w:val="000000"/>
                 <w:sz w:val="19"/>
               </w:rPr>
-              <w:t>☒ utilizado   ☐ adaptado   ☐ descartado</w:t>
-            </w:r>
-          </w:p>
-          <w:p>
-            <w:pPr>
-              <w:spacing w:after="40" w:line="259" w:lineRule="auto"/>
-            </w:pPr>
-            <w:r>
-              <w:rPr>
-                <w:rFonts w:ascii="Aptos" w:hAnsi="Aptos"/>
-                <w:b w:val="0"/>
-                <w:color w:val="000000"/>
-                <w:sz w:val="19"/>
-              </w:rPr>
-              <w:t>Justificativa: a implementação atendeu integralmente aos critérios de aceitação da Spec 001, respeitou os princípios da constituição do FluxID e obteve aprovação total em 100% dos testes e medições de desempenho.</w:t>
+              <w:t>utilizado</w:t>
             </w:r>
           </w:p>
         </w:tc>
@@ -1309,7 +1295,7 @@
                 <w:color w:val="000000"/>
                 <w:sz w:val="19"/>
               </w:rPr>
-              <w:t>Alisson Almeida (Líder Técnico / Equipe FluxID)</w:t>
+              <w:t>Equipe</w:t>
             </w:r>
           </w:p>
         </w:tc>
@@ -1382,7 +1368,7 @@
                 <w:color w:val="000000"/>
                 <w:sz w:val="19"/>
               </w:rPr>
-              <w:t>28/09/2026   Assinatura ou rubrica: Alisson Almeida</w:t>
+              <w:t>28/09/2026</w:t>
             </w:r>
           </w:p>
         </w:tc>

</xml_diff>